<commit_message>
devoir de symfony plus cahier de charge
</commit_message>
<xml_diff>
--- a/Cahier_des_Charges_AllGames (1).docx
+++ b/Cahier_des_Charges_AllGames (1).docx
@@ -95,7 +95,16 @@
           <w:sz w:val="24"/>
           <w:szCs w:val="24"/>
         </w:rPr>
-        <w:t>Symphony</w:t>
+        <w:t>Symfo</w:t>
+      </w:r>
+      <w:bookmarkStart w:id="0" w:name="_GoBack"/>
+      <w:bookmarkEnd w:id="0"/>
+      <w:r>
+        <w:rPr>
+          <w:sz w:val="24"/>
+          <w:szCs w:val="24"/>
+        </w:rPr>
+        <w:t>ny</w:t>
       </w:r>
       <w:r>
         <w:rPr>
@@ -259,12 +268,7 @@
         <w:spacing w:line="240" w:lineRule="auto"/>
       </w:pPr>
       <w:r>
-        <w:t>-</w:t>
-      </w:r>
-      <w:bookmarkStart w:id="0" w:name="_GoBack"/>
-      <w:bookmarkEnd w:id="0"/>
-      <w:r>
-        <w:t xml:space="preserve"> Permettre la consultation d’un </w:t>
+        <w:t xml:space="preserve">- Permettre la consultation d’un </w:t>
       </w:r>
       <w:r>
         <w:t>catalogues</w:t>
@@ -316,10 +320,7 @@
         <w:spacing w:line="240" w:lineRule="auto"/>
       </w:pPr>
       <w:r>
-        <w:t>-</w:t>
-      </w:r>
-      <w:r>
-        <w:t xml:space="preserve"> Permettre aux utilisateurs de laisser des avis.</w:t>
+        <w:t>- Permettre aux utilisateurs de laisser des avis.</w:t>
       </w:r>
     </w:p>
     <w:p>
@@ -398,10 +399,7 @@
         <w:spacing w:line="240" w:lineRule="auto"/>
       </w:pPr>
       <w:r>
-        <w:t>- Consu</w:t>
-      </w:r>
-      <w:r>
-        <w:t>lter la page d’accueil.</w:t>
+        <w:t>- Consulter la page d’accueil.</w:t>
       </w:r>
     </w:p>
     <w:p>
@@ -445,10 +443,7 @@
       </w:r>
       <w:proofErr w:type="spellStart"/>
       <w:r>
-        <w:t>Foncti</w:t>
-      </w:r>
-      <w:r>
-        <w:t>onnalités</w:t>
+        <w:t>Fonctionnalités</w:t>
       </w:r>
       <w:proofErr w:type="spellEnd"/>
       <w:r>
@@ -460,10 +455,7 @@
       </w:r>
       <w:proofErr w:type="spellEnd"/>
       <w:r>
-        <w:t xml:space="preserve"> (ROLE_USER</w:t>
-      </w:r>
-      <w:r>
-        <w:t>)</w:t>
+        <w:t xml:space="preserve"> (ROLE_USER)</w:t>
       </w:r>
     </w:p>
     <w:p>
@@ -487,10 +479,7 @@
         <w:spacing w:line="240" w:lineRule="auto"/>
       </w:pPr>
       <w:r>
-        <w:t>- Re</w:t>
-      </w:r>
-      <w:r>
-        <w:t>tirer un jeu de la wishlist.</w:t>
+        <w:t>- Retirer un jeu de la wishlist.</w:t>
       </w:r>
     </w:p>
     <w:p>
@@ -498,7 +487,15 @@
         <w:spacing w:line="240" w:lineRule="auto"/>
       </w:pPr>
       <w:r>
-        <w:t xml:space="preserve">- Laisser un </w:t>
+        <w:t xml:space="preserve">- </w:t>
+      </w:r>
+      <w:proofErr w:type="spellStart"/>
+      <w:r>
+        <w:t>Laisser</w:t>
+      </w:r>
+      <w:proofErr w:type="spellEnd"/>
+      <w:r>
+        <w:t xml:space="preserve"> un </w:t>
       </w:r>
       <w:proofErr w:type="spellStart"/>
       <w:r>
@@ -535,10 +532,18 @@
         <w:spacing w:line="240" w:lineRule="auto"/>
       </w:pPr>
       <w:r>
-        <w:t xml:space="preserve">- Voir les </w:t>
+        <w:t xml:space="preserve">- </w:t>
       </w:r>
       <w:proofErr w:type="spellStart"/>
       <w:r>
+        <w:t>Voir</w:t>
+      </w:r>
+      <w:proofErr w:type="spellEnd"/>
+      <w:r>
+        <w:t xml:space="preserve"> les </w:t>
+      </w:r>
+      <w:proofErr w:type="spellStart"/>
+      <w:r>
         <w:t>avis</w:t>
       </w:r>
       <w:proofErr w:type="spellEnd"/>
@@ -547,10 +552,7 @@
       </w:r>
       <w:proofErr w:type="spellStart"/>
       <w:r>
-        <w:t>autre</w:t>
-      </w:r>
-      <w:r>
-        <w:t>s</w:t>
+        <w:t>autres</w:t>
       </w:r>
       <w:proofErr w:type="spellEnd"/>
       <w:r>
@@ -618,10 +620,7 @@
         <w:spacing w:line="240" w:lineRule="auto"/>
       </w:pPr>
       <w:r>
-        <w:t xml:space="preserve">- Modifier un jeu </w:t>
-      </w:r>
-      <w:r>
-        <w:t>existant.</w:t>
+        <w:t>- Modifier un jeu existant.</w:t>
       </w:r>
     </w:p>
     <w:p>
@@ -750,10 +749,7 @@
       </w:r>
       <w:proofErr w:type="gramStart"/>
       <w:r>
-        <w:t>Authentification</w:t>
-      </w:r>
-      <w:r>
-        <w:t xml:space="preserve"> :</w:t>
+        <w:t>Authentification :</w:t>
       </w:r>
       <w:proofErr w:type="gramEnd"/>
       <w:r>
@@ -899,10 +895,7 @@
         <w:spacing w:line="240" w:lineRule="auto"/>
       </w:pPr>
       <w:r>
-        <w:t>- password</w:t>
-      </w:r>
-      <w:r>
-        <w:t xml:space="preserve"> (hash sécurisé)</w:t>
+        <w:t>- password (hash sécurisé)</w:t>
       </w:r>
     </w:p>
     <w:p>
@@ -1013,10 +1006,7 @@
         <w:spacing w:line="240" w:lineRule="auto"/>
       </w:pPr>
       <w:r>
-        <w:t xml:space="preserve">- CSRF </w:t>
-      </w:r>
-      <w:r>
-        <w:t>activé pour les formulaires.</w:t>
+        <w:t>- CSRF activé pour les formulaires.</w:t>
       </w:r>
     </w:p>
     <w:p>
@@ -13220,7 +13210,7 @@
 </file>
 
 <file path=customXml/itemProps1.xml><?xml version="1.0" encoding="utf-8"?>
-<ds:datastoreItem xmlns:ds="http://schemas.openxmlformats.org/officeDocument/2006/customXml" ds:itemID="{522D958E-BC36-473D-8D5E-AD860B5BB21A}">
+<ds:datastoreItem xmlns:ds="http://schemas.openxmlformats.org/officeDocument/2006/customXml" ds:itemID="{560F11CB-E7E4-4E43-A90C-A5BE9AB96346}">
   <ds:schemaRefs>
     <ds:schemaRef ds:uri="http://schemas.openxmlformats.org/officeDocument/2006/bibliography"/>
   </ds:schemaRefs>

</xml_diff>

<commit_message>
devoir de symfony + cahier de charge
</commit_message>
<xml_diff>
--- a/Cahier_des_Charges_AllGames (1).docx
+++ b/Cahier_des_Charges_AllGames (1).docx
@@ -97,8 +97,6 @@
         </w:rPr>
         <w:t>Symfo</w:t>
       </w:r>
-      <w:bookmarkStart w:id="0" w:name="_GoBack"/>
-      <w:bookmarkEnd w:id="0"/>
       <w:r>
         <w:rPr>
           <w:sz w:val="24"/>
@@ -1075,8 +1073,162 @@
         <w:spacing w:line="240" w:lineRule="auto"/>
       </w:pPr>
       <w:r>
-        <w:t>- Page détail stylisée avec image + statistiques + avis.</w:t>
-      </w:r>
+        <w:t xml:space="preserve">- Page détail stylisée avec image + </w:t>
+      </w:r>
+      <w:proofErr w:type="spellStart"/>
+      <w:r>
+        <w:t>statistiques</w:t>
+      </w:r>
+      <w:proofErr w:type="spellEnd"/>
+      <w:r>
+        <w:t xml:space="preserve"> + </w:t>
+      </w:r>
+      <w:proofErr w:type="spellStart"/>
+      <w:r>
+        <w:t>avis</w:t>
+      </w:r>
+      <w:proofErr w:type="spellEnd"/>
+      <w:r>
+        <w:t>.</w:t>
+      </w:r>
+    </w:p>
+    <w:p>
+      <w:pPr>
+        <w:pStyle w:val="Paragraphedeliste"/>
+        <w:numPr>
+          <w:ilvl w:val="0"/>
+          <w:numId w:val="11"/>
+        </w:numPr>
+        <w:spacing w:line="240" w:lineRule="auto"/>
+      </w:pPr>
+      <w:r>
+        <w:t xml:space="preserve">Pour se connecter </w:t>
+      </w:r>
+    </w:p>
+    <w:p>
+      <w:pPr>
+        <w:pStyle w:val="Paragraphedeliste"/>
+        <w:spacing w:line="240" w:lineRule="auto"/>
+        <w:ind w:left="1080"/>
+      </w:pPr>
+    </w:p>
+    <w:p>
+      <w:pPr>
+        <w:pStyle w:val="Paragraphedeliste"/>
+        <w:numPr>
+          <w:ilvl w:val="1"/>
+          <w:numId w:val="12"/>
+        </w:numPr>
+        <w:spacing w:line="240" w:lineRule="auto"/>
+        <w:ind w:left="720"/>
+      </w:pPr>
+      <w:r>
+        <w:t>User</w:t>
+      </w:r>
+    </w:p>
+    <w:p>
+      <w:pPr>
+        <w:spacing w:before="240" w:line="240" w:lineRule="auto"/>
+      </w:pPr>
+      <w:r>
+        <w:t xml:space="preserve">-email : </w:t>
+      </w:r>
+      <w:hyperlink r:id="rId6" w:history="1">
+        <w:r>
+          <w:rPr>
+            <w:rStyle w:val="Lienhypertexte"/>
+          </w:rPr>
+          <w:t>user1@gmail.com</w:t>
+        </w:r>
+      </w:hyperlink>
+    </w:p>
+    <w:p>
+      <w:pPr>
+        <w:spacing w:before="240" w:line="240" w:lineRule="auto"/>
+      </w:pPr>
+      <w:r>
+        <w:t xml:space="preserve">-mot de </w:t>
+      </w:r>
+      <w:proofErr w:type="spellStart"/>
+      <w:proofErr w:type="gramStart"/>
+      <w:r>
+        <w:t>passe</w:t>
+      </w:r>
+      <w:proofErr w:type="spellEnd"/>
+      <w:r>
+        <w:t xml:space="preserve"> :</w:t>
+      </w:r>
+      <w:proofErr w:type="gramEnd"/>
+      <w:r>
+        <w:t xml:space="preserve"> user1234</w:t>
+      </w:r>
+    </w:p>
+    <w:p>
+      <w:pPr>
+        <w:pStyle w:val="Paragraphedeliste"/>
+        <w:numPr>
+          <w:ilvl w:val="1"/>
+          <w:numId w:val="12"/>
+        </w:numPr>
+        <w:spacing w:before="240" w:line="240" w:lineRule="auto"/>
+        <w:ind w:left="720"/>
+      </w:pPr>
+      <w:proofErr w:type="spellStart"/>
+      <w:r>
+        <w:lastRenderedPageBreak/>
+        <w:t>Administrat</w:t>
+      </w:r>
+      <w:bookmarkStart w:id="0" w:name="_GoBack"/>
+      <w:bookmarkEnd w:id="0"/>
+      <w:r>
+        <w:t>eur</w:t>
+      </w:r>
+      <w:proofErr w:type="spellEnd"/>
+      <w:r>
+        <w:t xml:space="preserve"> </w:t>
+      </w:r>
+    </w:p>
+    <w:p>
+      <w:pPr>
+        <w:spacing w:before="240" w:line="240" w:lineRule="auto"/>
+      </w:pPr>
+      <w:r>
+        <w:t xml:space="preserve">-email : </w:t>
+      </w:r>
+      <w:hyperlink r:id="rId7" w:history="1">
+        <w:r>
+          <w:rPr>
+            <w:rStyle w:val="Lienhypertexte"/>
+          </w:rPr>
+          <w:t>admin@gmail.com</w:t>
+        </w:r>
+      </w:hyperlink>
+    </w:p>
+    <w:p>
+      <w:pPr>
+        <w:spacing w:before="240" w:line="240" w:lineRule="auto"/>
+      </w:pPr>
+      <w:r>
+        <w:t xml:space="preserve">-mot de </w:t>
+      </w:r>
+      <w:proofErr w:type="spellStart"/>
+      <w:proofErr w:type="gramStart"/>
+      <w:r>
+        <w:t>passe</w:t>
+      </w:r>
+      <w:proofErr w:type="spellEnd"/>
+      <w:r>
+        <w:t xml:space="preserve"> :</w:t>
+      </w:r>
+      <w:proofErr w:type="gramEnd"/>
+      <w:r>
+        <w:t xml:space="preserve"> admin123</w:t>
+      </w:r>
+    </w:p>
+    <w:p>
+      <w:pPr>
+        <w:spacing w:line="240" w:lineRule="auto"/>
+      </w:pPr>
     </w:p>
     <w:p>
       <w:pPr>
@@ -1312,7 +1464,7 @@
         <w:rFonts w:hint="default"/>
       </w:rPr>
     </w:lvl>
-    <w:lvl w:ilvl="1" w:tplc="040C0019" w:tentative="1">
+    <w:lvl w:ilvl="1" w:tplc="040C0019">
       <w:start w:val="1"/>
       <w:numFmt w:val="lowerLetter"/>
       <w:lvlText w:val="%2."/>
@@ -1386,6 +1538,92 @@
     </w:lvl>
   </w:abstractNum>
   <w:abstractNum w:abstractNumId="10" w15:restartNumberingAfterBreak="0">
+    <w:nsid w:val="2F994197"/>
+    <w:multiLevelType w:val="hybridMultilevel"/>
+    <w:tmpl w:val="8D72B3C4"/>
+    <w:lvl w:ilvl="0" w:tplc="040C0013">
+      <w:start w:val="1"/>
+      <w:numFmt w:val="upperRoman"/>
+      <w:lvlText w:val="%1."/>
+      <w:lvlJc w:val="right"/>
+      <w:pPr>
+        <w:ind w:left="1800" w:hanging="360"/>
+      </w:pPr>
+    </w:lvl>
+    <w:lvl w:ilvl="1" w:tplc="040C0019" w:tentative="1">
+      <w:start w:val="1"/>
+      <w:numFmt w:val="lowerLetter"/>
+      <w:lvlText w:val="%2."/>
+      <w:lvlJc w:val="left"/>
+      <w:pPr>
+        <w:ind w:left="2520" w:hanging="360"/>
+      </w:pPr>
+    </w:lvl>
+    <w:lvl w:ilvl="2" w:tplc="040C001B" w:tentative="1">
+      <w:start w:val="1"/>
+      <w:numFmt w:val="lowerRoman"/>
+      <w:lvlText w:val="%3."/>
+      <w:lvlJc w:val="right"/>
+      <w:pPr>
+        <w:ind w:left="3240" w:hanging="180"/>
+      </w:pPr>
+    </w:lvl>
+    <w:lvl w:ilvl="3" w:tplc="040C000F" w:tentative="1">
+      <w:start w:val="1"/>
+      <w:numFmt w:val="decimal"/>
+      <w:lvlText w:val="%4."/>
+      <w:lvlJc w:val="left"/>
+      <w:pPr>
+        <w:ind w:left="3960" w:hanging="360"/>
+      </w:pPr>
+    </w:lvl>
+    <w:lvl w:ilvl="4" w:tplc="040C0019" w:tentative="1">
+      <w:start w:val="1"/>
+      <w:numFmt w:val="lowerLetter"/>
+      <w:lvlText w:val="%5."/>
+      <w:lvlJc w:val="left"/>
+      <w:pPr>
+        <w:ind w:left="4680" w:hanging="360"/>
+      </w:pPr>
+    </w:lvl>
+    <w:lvl w:ilvl="5" w:tplc="040C001B" w:tentative="1">
+      <w:start w:val="1"/>
+      <w:numFmt w:val="lowerRoman"/>
+      <w:lvlText w:val="%6."/>
+      <w:lvlJc w:val="right"/>
+      <w:pPr>
+        <w:ind w:left="5400" w:hanging="180"/>
+      </w:pPr>
+    </w:lvl>
+    <w:lvl w:ilvl="6" w:tplc="040C000F" w:tentative="1">
+      <w:start w:val="1"/>
+      <w:numFmt w:val="decimal"/>
+      <w:lvlText w:val="%7."/>
+      <w:lvlJc w:val="left"/>
+      <w:pPr>
+        <w:ind w:left="6120" w:hanging="360"/>
+      </w:pPr>
+    </w:lvl>
+    <w:lvl w:ilvl="7" w:tplc="040C0019" w:tentative="1">
+      <w:start w:val="1"/>
+      <w:numFmt w:val="lowerLetter"/>
+      <w:lvlText w:val="%8."/>
+      <w:lvlJc w:val="left"/>
+      <w:pPr>
+        <w:ind w:left="6840" w:hanging="360"/>
+      </w:pPr>
+    </w:lvl>
+    <w:lvl w:ilvl="8" w:tplc="040C001B" w:tentative="1">
+      <w:start w:val="1"/>
+      <w:numFmt w:val="lowerRoman"/>
+      <w:lvlText w:val="%9."/>
+      <w:lvlJc w:val="right"/>
+      <w:pPr>
+        <w:ind w:left="7560" w:hanging="180"/>
+      </w:pPr>
+    </w:lvl>
+  </w:abstractNum>
+  <w:abstractNum w:abstractNumId="11" w15:restartNumberingAfterBreak="0">
     <w:nsid w:val="71A64F84"/>
     <w:multiLevelType w:val="hybridMultilevel"/>
     <w:tmpl w:val="924022AA"/>
@@ -1499,10 +1737,43 @@
     <w:abstractNumId w:val="0"/>
   </w:num>
   <w:num w:numId="10">
-    <w:abstractNumId w:val="10"/>
+    <w:abstractNumId w:val="11"/>
   </w:num>
   <w:num w:numId="11">
     <w:abstractNumId w:val="9"/>
+  </w:num>
+  <w:num w:numId="12">
+    <w:abstractNumId w:val="9"/>
+    <w:lvlOverride w:ilvl="0">
+      <w:startOverride w:val="1"/>
+    </w:lvlOverride>
+    <w:lvlOverride w:ilvl="1">
+      <w:startOverride w:val="1"/>
+    </w:lvlOverride>
+    <w:lvlOverride w:ilvl="2">
+      <w:startOverride w:val="1"/>
+    </w:lvlOverride>
+    <w:lvlOverride w:ilvl="3">
+      <w:startOverride w:val="1"/>
+    </w:lvlOverride>
+    <w:lvlOverride w:ilvl="4">
+      <w:startOverride w:val="1"/>
+    </w:lvlOverride>
+    <w:lvlOverride w:ilvl="5">
+      <w:startOverride w:val="1"/>
+    </w:lvlOverride>
+    <w:lvlOverride w:ilvl="6">
+      <w:startOverride w:val="1"/>
+    </w:lvlOverride>
+    <w:lvlOverride w:ilvl="7">
+      <w:startOverride w:val="1"/>
+    </w:lvlOverride>
+    <w:lvlOverride w:ilvl="8">
+      <w:startOverride w:val="1"/>
+    </w:lvlOverride>
+  </w:num>
+  <w:num w:numId="13">
+    <w:abstractNumId w:val="10"/>
   </w:num>
 </w:numbering>
 </file>
@@ -12882,6 +13153,18 @@
       </w:tcPr>
     </w:tblStylePr>
   </w:style>
+  <w:style w:type="character" w:styleId="Lienhypertexte">
+    <w:name w:val="Hyperlink"/>
+    <w:basedOn w:val="Policepardfaut"/>
+    <w:uiPriority w:val="99"/>
+    <w:semiHidden/>
+    <w:unhideWhenUsed/>
+    <w:rsid w:val="001D3492"/>
+    <w:rPr>
+      <w:color w:val="0000FF" w:themeColor="hyperlink"/>
+      <w:u w:val="single"/>
+    </w:rPr>
+  </w:style>
 </w:styles>
 </file>
 
@@ -13210,7 +13493,7 @@
 </file>
 
 <file path=customXml/itemProps1.xml><?xml version="1.0" encoding="utf-8"?>
-<ds:datastoreItem xmlns:ds="http://schemas.openxmlformats.org/officeDocument/2006/customXml" ds:itemID="{560F11CB-E7E4-4E43-A90C-A5BE9AB96346}">
+<ds:datastoreItem xmlns:ds="http://schemas.openxmlformats.org/officeDocument/2006/customXml" ds:itemID="{D6A26A5D-1D9E-4382-B782-EC4FF9D9BBE3}">
   <ds:schemaRefs>
     <ds:schemaRef ds:uri="http://schemas.openxmlformats.org/officeDocument/2006/bibliography"/>
   </ds:schemaRefs>

</xml_diff>